<commit_message>
selling: give Elena a signing line in the Datastar NDA
Her signature box had no blank line above her name, so there was nowhere to
place a signature — Datastar's box has had one all along. Added to both
serialisations, since Word writes each text box twice (mc:Choice and
mc:Fallback) and fixing one leaves the other rendering the old layout.
Her box keeps spAutoFit, so it grows around a pasted signature image
instead of cropping it.

Renders now go through LibreOffice on the real .docx instead of rebuilding
the text into a lookalike PDF. That is what surfaced the clipped
"Representante Legal" in Datastar's own signature box — a text extract
contains every word of that block and cannot show that a line of it falls
outside the frame. Their box is left untouched; preview/original-page4.png
is the evidence the clipping is theirs.

Co-authored-by: Elena <aipa@aideazz.xyz>
</commit_message>
<xml_diff>
--- a/docs/selling/datastar/NDA_Datastar_Elena_Revicheva_DRAFT.docx
+++ b/docs/selling/datastar/NDA_Datastar_Elena_Revicheva_DRAFT.docx
@@ -434,6 +434,14 @@
                                 <w:lang w:val="en-US"/>
                               </w:rPr>
                             </w:pPr>
+                          </w:p>
+                          <w:p>
+                            <w:pPr>
+                              <w:jc w:val="center"/>
+                              <w:rPr>
+                                <w:lang w:val="en-US"/>
+                              </w:rPr>
+                            </w:pPr>
                             <w:proofErr w:type="spellStart"/>
                             <w:r>
                               <w:rPr>
@@ -507,6 +515,14 @@
               <v:shape id="_x0000_s1027" type="#_x0000_t202" style="position:absolute;margin-left:268.2pt;margin-top:1.85pt;width:180.3pt;height:82.85pt;z-index:-251655168;visibility:visible;mso-wrap-style:square;mso-width-percent:0;mso-height-percent:200;mso-wrap-distance-left:9pt;mso-wrap-distance-top:3.6pt;mso-wrap-distance-right:9pt;mso-wrap-distance-bottom:3.6pt;mso-position-horizontal:absolute;mso-position-horizontal-relative:text;mso-position-vertical:absolute;mso-position-vertical-relative:text;mso-width-percent:0;mso-height-percent:200;mso-width-relative:margin;mso-height-relative:margin;v-text-anchor:top" o:gfxdata="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" strokecolor="white [3212]">
                 <v:textbox style="mso-fit-shape-to-text:t">
                   <w:txbxContent>
+                    <w:p>
+                      <w:pPr>
+                        <w:jc w:val="center"/>
+                        <w:rPr>
+                          <w:lang w:val="en-US"/>
+                        </w:rPr>
+                      </w:pPr>
+                    </w:p>
                     <w:p>
                       <w:pPr>
                         <w:jc w:val="center"/>

</xml_diff>